<commit_message>
Capturas DAW - CN
</commit_message>
<xml_diff>
--- a/Trabajos/Despliegue de Aplicaciones Web/iMarin_DAW_DU1_P2.docx
+++ b/Trabajos/Despliegue de Aplicaciones Web/iMarin_DAW_DU1_P2.docx
@@ -117,6 +117,7 @@
                                     <w:dataBinding w:prefixMappings="xmlns:ns0='http://purl.org/dc/elements/1.1/' xmlns:ns1='http://schemas.openxmlformats.org/package/2006/metadata/core-properties' " w:xpath="/ns1:coreProperties[1]/ns0:title[1]" w:storeItemID="{6C3C8BC8-F283-45AE-878A-BAB7291924A1}"/>
                                     <w:text/>
                                   </w:sdtPr>
+                                  <w:sdtEndPr/>
                                   <w:sdtContent>
                                     <w:r>
                                       <w:rPr>
@@ -259,6 +260,7 @@
                               <w:dataBinding w:prefixMappings="xmlns:ns0='http://purl.org/dc/elements/1.1/' xmlns:ns1='http://schemas.openxmlformats.org/package/2006/metadata/core-properties' " w:xpath="/ns1:coreProperties[1]/ns0:title[1]" w:storeItemID="{6C3C8BC8-F283-45AE-878A-BAB7291924A1}"/>
                               <w:text/>
                             </w:sdtPr>
+                            <w:sdtEndPr/>
                             <w:sdtContent>
                               <w:r>
                                 <w:rPr>
@@ -511,6 +513,7 @@
                               <w:calendar w:val="gregorian"/>
                             </w:date>
                           </w:sdtPr>
+                          <w:sdtEndPr/>
                           <w:sdtContent>
                             <w:p>
                               <w:pPr>
@@ -545,8 +548,6 @@
             <w:br w:type="page"/>
           </w:r>
         </w:p>
-        <w:bookmarkStart w:id="0" w:name="_GoBack" w:displacedByCustomXml="next"/>
-        <w:bookmarkEnd w:id="0" w:displacedByCustomXml="next"/>
       </w:sdtContent>
     </w:sdt>
     <w:sdt>
@@ -608,13 +609,13 @@
           <w:r>
             <w:fldChar w:fldCharType="separate"/>
           </w:r>
-          <w:hyperlink w:anchor="_Toc240647015" w:history="1">
+          <w:hyperlink w:anchor="_Toc241858148" w:history="1">
             <w:r>
               <w:rPr>
                 <w:rStyle w:val="Hipervnculo"/>
                 <w:noProof/>
               </w:rPr>
-              <w:t>Ejercicio 1</w:t>
+              <w:t>Creación del servlet</w:t>
             </w:r>
             <w:r>
               <w:rPr>
@@ -635,7 +636,7 @@
                 <w:noProof/>
                 <w:webHidden/>
               </w:rPr>
-              <w:instrText xml:space="preserve"> PAGEREF _Toc240647015 \h </w:instrText>
+              <w:instrText xml:space="preserve"> PAGEREF _Toc241858148 \h </w:instrText>
             </w:r>
             <w:r>
               <w:rPr>
@@ -678,13 +679,13 @@
               <w:lang w:eastAsia="es-ES"/>
             </w:rPr>
           </w:pPr>
-          <w:hyperlink w:anchor="_Toc240647016" w:history="1">
+          <w:hyperlink w:anchor="_Toc241858149" w:history="1">
             <w:r>
               <w:rPr>
                 <w:rStyle w:val="Hipervnculo"/>
                 <w:noProof/>
               </w:rPr>
-              <w:t>Ejercicio 2</w:t>
+              <w:t>Creación de aplicación simple</w:t>
             </w:r>
             <w:r>
               <w:rPr>
@@ -705,7 +706,7 @@
                 <w:noProof/>
                 <w:webHidden/>
               </w:rPr>
-              <w:instrText xml:space="preserve"> PAGEREF _Toc240647016 \h </w:instrText>
+              <w:instrText xml:space="preserve"> PAGEREF _Toc241858149 \h </w:instrText>
             </w:r>
             <w:r>
               <w:rPr>
@@ -725,7 +726,7 @@
                 <w:noProof/>
                 <w:webHidden/>
               </w:rPr>
-              <w:t>2</w:t>
+              <w:t>8</w:t>
             </w:r>
             <w:r>
               <w:rPr>
@@ -748,77 +749,7 @@
               <w:lang w:eastAsia="es-ES"/>
             </w:rPr>
           </w:pPr>
-          <w:hyperlink w:anchor="_Toc240647017" w:history="1">
-            <w:r>
-              <w:rPr>
-                <w:rStyle w:val="Hipervnculo"/>
-                <w:noProof/>
-              </w:rPr>
-              <w:t>Ejercicio 3</w:t>
-            </w:r>
-            <w:r>
-              <w:rPr>
-                <w:noProof/>
-                <w:webHidden/>
-              </w:rPr>
-              <w:tab/>
-            </w:r>
-            <w:r>
-              <w:rPr>
-                <w:noProof/>
-                <w:webHidden/>
-              </w:rPr>
-              <w:fldChar w:fldCharType="begin"/>
-            </w:r>
-            <w:r>
-              <w:rPr>
-                <w:noProof/>
-                <w:webHidden/>
-              </w:rPr>
-              <w:instrText xml:space="preserve"> PAGEREF _Toc240647017 \h </w:instrText>
-            </w:r>
-            <w:r>
-              <w:rPr>
-                <w:noProof/>
-                <w:webHidden/>
-              </w:rPr>
-            </w:r>
-            <w:r>
-              <w:rPr>
-                <w:noProof/>
-                <w:webHidden/>
-              </w:rPr>
-              <w:fldChar w:fldCharType="separate"/>
-            </w:r>
-            <w:r>
-              <w:rPr>
-                <w:noProof/>
-                <w:webHidden/>
-              </w:rPr>
-              <w:t>2</w:t>
-            </w:r>
-            <w:r>
-              <w:rPr>
-                <w:noProof/>
-                <w:webHidden/>
-              </w:rPr>
-              <w:fldChar w:fldCharType="end"/>
-            </w:r>
-          </w:hyperlink>
-        </w:p>
-        <w:p>
-          <w:pPr>
-            <w:pStyle w:val="TDC1"/>
-            <w:tabs>
-              <w:tab w:val="right" w:leader="dot" w:pos="8494"/>
-            </w:tabs>
-            <w:rPr>
-              <w:rFonts w:eastAsiaTheme="minorEastAsia"/>
-              <w:noProof/>
-              <w:lang w:eastAsia="es-ES"/>
-            </w:rPr>
-          </w:pPr>
-          <w:hyperlink w:anchor="_Toc240647018" w:history="1">
+          <w:hyperlink w:anchor="_Toc241858150" w:history="1">
             <w:r>
               <w:rPr>
                 <w:rStyle w:val="Hipervnculo"/>
@@ -845,7 +776,7 @@
                 <w:noProof/>
                 <w:webHidden/>
               </w:rPr>
-              <w:instrText xml:space="preserve"> PAGEREF _Toc240647018 \h </w:instrText>
+              <w:instrText xml:space="preserve"> PAGEREF _Toc241858150 \h </w:instrText>
             </w:r>
             <w:r>
               <w:rPr>
@@ -865,7 +796,7 @@
                 <w:noProof/>
                 <w:webHidden/>
               </w:rPr>
-              <w:t>3</w:t>
+              <w:t>9</w:t>
             </w:r>
             <w:r>
               <w:rPr>
@@ -907,35 +838,704 @@
         <w:pStyle w:val="Ttulo1"/>
         <w:spacing w:after="240"/>
       </w:pPr>
-      <w:bookmarkStart w:id="1" w:name="_Toc240646879"/>
-      <w:bookmarkStart w:id="2" w:name="_Toc240647015"/>
+      <w:bookmarkStart w:id="0" w:name="_Toc241858148"/>
       <w:r>
         <w:lastRenderedPageBreak/>
-        <w:t>Ejercicio 1</w:t>
+        <w:t xml:space="preserve">Creación del </w:t>
+      </w:r>
+      <w:proofErr w:type="spellStart"/>
+      <w:r>
+        <w:t>servlet</w:t>
+      </w:r>
+      <w:bookmarkEnd w:id="0"/>
+      <w:proofErr w:type="spellEnd"/>
+    </w:p>
+    <w:p>
+      <w:bookmarkStart w:id="1" w:name="_Toc240646880"/>
+      <w:r>
+        <w:drawing>
+          <wp:inline distT="0" distB="0" distL="0" distR="0" wp14:anchorId="0D1ABC4F" wp14:editId="55B6CBC2">
+            <wp:extent cx="5400040" cy="3035935"/>
+            <wp:effectExtent l="0" t="0" r="0" b="0"/>
+            <wp:docPr id="1" name="Imagen 1"/>
+            <wp:cNvGraphicFramePr>
+              <a:graphicFrameLocks xmlns:a="http://schemas.openxmlformats.org/drawingml/2006/main" noChangeAspect="1"/>
+            </wp:cNvGraphicFramePr>
+            <a:graphic xmlns:a="http://schemas.openxmlformats.org/drawingml/2006/main">
+              <a:graphicData uri="http://schemas.openxmlformats.org/drawingml/2006/picture">
+                <pic:pic xmlns:pic="http://schemas.openxmlformats.org/drawingml/2006/picture">
+                  <pic:nvPicPr>
+                    <pic:cNvPr id="1" name=""/>
+                    <pic:cNvPicPr/>
+                  </pic:nvPicPr>
+                  <pic:blipFill>
+                    <a:blip r:embed="rId8"/>
+                    <a:stretch>
+                      <a:fillRect/>
+                    </a:stretch>
+                  </pic:blipFill>
+                  <pic:spPr>
+                    <a:xfrm>
+                      <a:off x="0" y="0"/>
+                      <a:ext cx="5400040" cy="3035935"/>
+                    </a:xfrm>
+                    <a:prstGeom prst="rect">
+                      <a:avLst/>
+                    </a:prstGeom>
+                  </pic:spPr>
+                </pic:pic>
+              </a:graphicData>
+            </a:graphic>
+          </wp:inline>
+        </w:drawing>
+      </w:r>
+    </w:p>
+    <w:p>
+      <w:r>
+        <w:t>P</w:t>
       </w:r>
       <w:bookmarkEnd w:id="1"/>
-      <w:bookmarkEnd w:id="2"/>
+      <w:r>
+        <w:t>ágina de Tomcat abierta una vez iniciado el servicio e instalado el JRE (en mi caso, JDK 17).</w:t>
+      </w:r>
+    </w:p>
+    <w:p>
+      <w:r>
+        <w:drawing>
+          <wp:inline distT="0" distB="0" distL="0" distR="0" wp14:anchorId="60B3BFFE" wp14:editId="6AD97067">
+            <wp:extent cx="5400040" cy="3063240"/>
+            <wp:effectExtent l="0" t="0" r="0" b="3810"/>
+            <wp:docPr id="2" name="Imagen 2"/>
+            <wp:cNvGraphicFramePr>
+              <a:graphicFrameLocks xmlns:a="http://schemas.openxmlformats.org/drawingml/2006/main" noChangeAspect="1"/>
+            </wp:cNvGraphicFramePr>
+            <a:graphic xmlns:a="http://schemas.openxmlformats.org/drawingml/2006/main">
+              <a:graphicData uri="http://schemas.openxmlformats.org/drawingml/2006/picture">
+                <pic:pic xmlns:pic="http://schemas.openxmlformats.org/drawingml/2006/picture">
+                  <pic:nvPicPr>
+                    <pic:cNvPr id="1" name=""/>
+                    <pic:cNvPicPr/>
+                  </pic:nvPicPr>
+                  <pic:blipFill>
+                    <a:blip r:embed="rId9"/>
+                    <a:stretch>
+                      <a:fillRect/>
+                    </a:stretch>
+                  </pic:blipFill>
+                  <pic:spPr>
+                    <a:xfrm>
+                      <a:off x="0" y="0"/>
+                      <a:ext cx="5400040" cy="3063240"/>
+                    </a:xfrm>
+                    <a:prstGeom prst="rect">
+                      <a:avLst/>
+                    </a:prstGeom>
+                  </pic:spPr>
+                </pic:pic>
+              </a:graphicData>
+            </a:graphic>
+          </wp:inline>
+        </w:drawing>
+      </w:r>
+    </w:p>
+    <w:p>
+      <w:r>
+        <w:t>Software de Eclipse ya abierto.</w:t>
+      </w:r>
+    </w:p>
+    <w:p>
+      <w:r>
+        <w:lastRenderedPageBreak/>
+        <w:drawing>
+          <wp:inline distT="0" distB="0" distL="0" distR="0" wp14:anchorId="32BA064C" wp14:editId="25905439">
+            <wp:extent cx="5400040" cy="3035935"/>
+            <wp:effectExtent l="0" t="0" r="0" b="0"/>
+            <wp:docPr id="3" name="Imagen 3"/>
+            <wp:cNvGraphicFramePr>
+              <a:graphicFrameLocks xmlns:a="http://schemas.openxmlformats.org/drawingml/2006/main" noChangeAspect="1"/>
+            </wp:cNvGraphicFramePr>
+            <a:graphic xmlns:a="http://schemas.openxmlformats.org/drawingml/2006/main">
+              <a:graphicData uri="http://schemas.openxmlformats.org/drawingml/2006/picture">
+                <pic:pic xmlns:pic="http://schemas.openxmlformats.org/drawingml/2006/picture">
+                  <pic:nvPicPr>
+                    <pic:cNvPr id="1" name=""/>
+                    <pic:cNvPicPr/>
+                  </pic:nvPicPr>
+                  <pic:blipFill>
+                    <a:blip r:embed="rId10"/>
+                    <a:stretch>
+                      <a:fillRect/>
+                    </a:stretch>
+                  </pic:blipFill>
+                  <pic:spPr>
+                    <a:xfrm>
+                      <a:off x="0" y="0"/>
+                      <a:ext cx="5400040" cy="3035935"/>
+                    </a:xfrm>
+                    <a:prstGeom prst="rect">
+                      <a:avLst/>
+                    </a:prstGeom>
+                  </pic:spPr>
+                </pic:pic>
+              </a:graphicData>
+            </a:graphic>
+          </wp:inline>
+        </w:drawing>
+      </w:r>
+    </w:p>
+    <w:p>
+      <w:r>
+        <w:t>Servidor de aplicaciones ya definido en Eclipse, habiendo elegido nuestro JRE.</w:t>
+      </w:r>
+    </w:p>
+    <w:p>
+      <w:r>
+        <w:drawing>
+          <wp:inline distT="0" distB="0" distL="0" distR="0" wp14:anchorId="2CFBD48B" wp14:editId="5415970F">
+            <wp:extent cx="5400040" cy="3035935"/>
+            <wp:effectExtent l="0" t="0" r="0" b="0"/>
+            <wp:docPr id="4" name="Imagen 4"/>
+            <wp:cNvGraphicFramePr>
+              <a:graphicFrameLocks xmlns:a="http://schemas.openxmlformats.org/drawingml/2006/main" noChangeAspect="1"/>
+            </wp:cNvGraphicFramePr>
+            <a:graphic xmlns:a="http://schemas.openxmlformats.org/drawingml/2006/main">
+              <a:graphicData uri="http://schemas.openxmlformats.org/drawingml/2006/picture">
+                <pic:pic xmlns:pic="http://schemas.openxmlformats.org/drawingml/2006/picture">
+                  <pic:nvPicPr>
+                    <pic:cNvPr id="1" name=""/>
+                    <pic:cNvPicPr/>
+                  </pic:nvPicPr>
+                  <pic:blipFill>
+                    <a:blip r:embed="rId11"/>
+                    <a:stretch>
+                      <a:fillRect/>
+                    </a:stretch>
+                  </pic:blipFill>
+                  <pic:spPr>
+                    <a:xfrm>
+                      <a:off x="0" y="0"/>
+                      <a:ext cx="5400040" cy="3035935"/>
+                    </a:xfrm>
+                    <a:prstGeom prst="rect">
+                      <a:avLst/>
+                    </a:prstGeom>
+                  </pic:spPr>
+                </pic:pic>
+              </a:graphicData>
+            </a:graphic>
+          </wp:inline>
+        </w:drawing>
+      </w:r>
+    </w:p>
+    <w:p>
+      <w:r>
+        <w:t>Menú de configuración del Proyecto Web Dinámico.</w:t>
+      </w:r>
+    </w:p>
+    <w:p>
+      <w:r>
+        <w:lastRenderedPageBreak/>
+        <w:drawing>
+          <wp:inline distT="0" distB="0" distL="0" distR="0" wp14:anchorId="5B510DFD" wp14:editId="4F928032">
+            <wp:extent cx="5400040" cy="3035935"/>
+            <wp:effectExtent l="0" t="0" r="0" b="0"/>
+            <wp:docPr id="5" name="Imagen 5"/>
+            <wp:cNvGraphicFramePr>
+              <a:graphicFrameLocks xmlns:a="http://schemas.openxmlformats.org/drawingml/2006/main" noChangeAspect="1"/>
+            </wp:cNvGraphicFramePr>
+            <a:graphic xmlns:a="http://schemas.openxmlformats.org/drawingml/2006/main">
+              <a:graphicData uri="http://schemas.openxmlformats.org/drawingml/2006/picture">
+                <pic:pic xmlns:pic="http://schemas.openxmlformats.org/drawingml/2006/picture">
+                  <pic:nvPicPr>
+                    <pic:cNvPr id="1" name=""/>
+                    <pic:cNvPicPr/>
+                  </pic:nvPicPr>
+                  <pic:blipFill>
+                    <a:blip r:embed="rId12"/>
+                    <a:stretch>
+                      <a:fillRect/>
+                    </a:stretch>
+                  </pic:blipFill>
+                  <pic:spPr>
+                    <a:xfrm>
+                      <a:off x="0" y="0"/>
+                      <a:ext cx="5400040" cy="3035935"/>
+                    </a:xfrm>
+                    <a:prstGeom prst="rect">
+                      <a:avLst/>
+                    </a:prstGeom>
+                  </pic:spPr>
+                </pic:pic>
+              </a:graphicData>
+            </a:graphic>
+          </wp:inline>
+        </w:drawing>
+      </w:r>
+    </w:p>
+    <w:p>
+      <w:r>
+        <w:t xml:space="preserve">Menú de creación del </w:t>
+      </w:r>
+      <w:proofErr w:type="spellStart"/>
+      <w:r>
+        <w:t>servlet</w:t>
+      </w:r>
+      <w:proofErr w:type="spellEnd"/>
+      <w:r>
+        <w:t>.</w:t>
+      </w:r>
+    </w:p>
+    <w:p>
+      <w:r>
+        <w:rPr>
+          <w:noProof/>
+          <w:lang w:eastAsia="es-ES"/>
+        </w:rPr>
+        <w:drawing>
+          <wp:inline distT="0" distB="0" distL="0" distR="0" wp14:anchorId="424CDD79" wp14:editId="19D94699">
+            <wp:extent cx="5400040" cy="3035935"/>
+            <wp:effectExtent l="0" t="0" r="0" b="0"/>
+            <wp:docPr id="6" name="Imagen 6"/>
+            <wp:cNvGraphicFramePr>
+              <a:graphicFrameLocks xmlns:a="http://schemas.openxmlformats.org/drawingml/2006/main" noChangeAspect="1"/>
+            </wp:cNvGraphicFramePr>
+            <a:graphic xmlns:a="http://schemas.openxmlformats.org/drawingml/2006/main">
+              <a:graphicData uri="http://schemas.openxmlformats.org/drawingml/2006/picture">
+                <pic:pic xmlns:pic="http://schemas.openxmlformats.org/drawingml/2006/picture">
+                  <pic:nvPicPr>
+                    <pic:cNvPr id="1" name=""/>
+                    <pic:cNvPicPr/>
+                  </pic:nvPicPr>
+                  <pic:blipFill>
+                    <a:blip r:embed="rId13"/>
+                    <a:stretch>
+                      <a:fillRect/>
+                    </a:stretch>
+                  </pic:blipFill>
+                  <pic:spPr>
+                    <a:xfrm>
+                      <a:off x="0" y="0"/>
+                      <a:ext cx="5400040" cy="3035935"/>
+                    </a:xfrm>
+                    <a:prstGeom prst="rect">
+                      <a:avLst/>
+                    </a:prstGeom>
+                  </pic:spPr>
+                </pic:pic>
+              </a:graphicData>
+            </a:graphic>
+          </wp:inline>
+        </w:drawing>
+      </w:r>
+    </w:p>
+    <w:p>
+      <w:r>
+        <w:t xml:space="preserve">Una vez salgamos del menú de creación del </w:t>
+      </w:r>
+      <w:proofErr w:type="spellStart"/>
+      <w:r>
+        <w:t>servlet</w:t>
+      </w:r>
+      <w:proofErr w:type="spellEnd"/>
+      <w:r>
+        <w:t>, obtendremos el siguiente código.</w:t>
+      </w:r>
+    </w:p>
+    <w:p>
+      <w:r>
+        <w:lastRenderedPageBreak/>
+        <w:drawing>
+          <wp:inline distT="0" distB="0" distL="0" distR="0" wp14:anchorId="3F7614AE" wp14:editId="30041A6C">
+            <wp:extent cx="5400040" cy="3035935"/>
+            <wp:effectExtent l="0" t="0" r="0" b="0"/>
+            <wp:docPr id="7" name="Imagen 7"/>
+            <wp:cNvGraphicFramePr>
+              <a:graphicFrameLocks xmlns:a="http://schemas.openxmlformats.org/drawingml/2006/main" noChangeAspect="1"/>
+            </wp:cNvGraphicFramePr>
+            <a:graphic xmlns:a="http://schemas.openxmlformats.org/drawingml/2006/main">
+              <a:graphicData uri="http://schemas.openxmlformats.org/drawingml/2006/picture">
+                <pic:pic xmlns:pic="http://schemas.openxmlformats.org/drawingml/2006/picture">
+                  <pic:nvPicPr>
+                    <pic:cNvPr id="1" name=""/>
+                    <pic:cNvPicPr/>
+                  </pic:nvPicPr>
+                  <pic:blipFill>
+                    <a:blip r:embed="rId14"/>
+                    <a:stretch>
+                      <a:fillRect/>
+                    </a:stretch>
+                  </pic:blipFill>
+                  <pic:spPr>
+                    <a:xfrm>
+                      <a:off x="0" y="0"/>
+                      <a:ext cx="5400040" cy="3035935"/>
+                    </a:xfrm>
+                    <a:prstGeom prst="rect">
+                      <a:avLst/>
+                    </a:prstGeom>
+                  </pic:spPr>
+                </pic:pic>
+              </a:graphicData>
+            </a:graphic>
+          </wp:inline>
+        </w:drawing>
+      </w:r>
+    </w:p>
+    <w:p>
+      <w:r>
+        <w:t xml:space="preserve">Modificamos los métodos </w:t>
+      </w:r>
+      <w:proofErr w:type="spellStart"/>
+      <w:r>
+        <w:t>doGet</w:t>
+      </w:r>
+      <w:proofErr w:type="spellEnd"/>
+      <w:r>
+        <w:t xml:space="preserve"> y </w:t>
+      </w:r>
+      <w:proofErr w:type="spellStart"/>
+      <w:r>
+        <w:t>doPost</w:t>
+      </w:r>
+      <w:proofErr w:type="spellEnd"/>
+      <w:r>
+        <w:t>.</w:t>
+      </w:r>
+    </w:p>
+    <w:p>
+      <w:r>
+        <w:drawing>
+          <wp:inline distT="0" distB="0" distL="0" distR="0" wp14:anchorId="28767874" wp14:editId="63F7BE19">
+            <wp:extent cx="5400040" cy="3035935"/>
+            <wp:effectExtent l="0" t="0" r="0" b="0"/>
+            <wp:docPr id="8" name="Imagen 8"/>
+            <wp:cNvGraphicFramePr>
+              <a:graphicFrameLocks xmlns:a="http://schemas.openxmlformats.org/drawingml/2006/main" noChangeAspect="1"/>
+            </wp:cNvGraphicFramePr>
+            <a:graphic xmlns:a="http://schemas.openxmlformats.org/drawingml/2006/main">
+              <a:graphicData uri="http://schemas.openxmlformats.org/drawingml/2006/picture">
+                <pic:pic xmlns:pic="http://schemas.openxmlformats.org/drawingml/2006/picture">
+                  <pic:nvPicPr>
+                    <pic:cNvPr id="1" name=""/>
+                    <pic:cNvPicPr/>
+                  </pic:nvPicPr>
+                  <pic:blipFill>
+                    <a:blip r:embed="rId15"/>
+                    <a:stretch>
+                      <a:fillRect/>
+                    </a:stretch>
+                  </pic:blipFill>
+                  <pic:spPr>
+                    <a:xfrm>
+                      <a:off x="0" y="0"/>
+                      <a:ext cx="5400040" cy="3035935"/>
+                    </a:xfrm>
+                    <a:prstGeom prst="rect">
+                      <a:avLst/>
+                    </a:prstGeom>
+                  </pic:spPr>
+                </pic:pic>
+              </a:graphicData>
+            </a:graphic>
+          </wp:inline>
+        </w:drawing>
+      </w:r>
+    </w:p>
+    <w:p>
+      <w:r>
+        <w:t xml:space="preserve">Menú de creación del archivo JSP en la carpeta </w:t>
+      </w:r>
+      <w:proofErr w:type="spellStart"/>
+      <w:r>
+        <w:t>webapps</w:t>
+      </w:r>
+      <w:proofErr w:type="spellEnd"/>
+      <w:r>
+        <w:t>.</w:t>
+      </w:r>
+    </w:p>
+    <w:p>
+      <w:r>
+        <w:lastRenderedPageBreak/>
+        <w:drawing>
+          <wp:inline distT="0" distB="0" distL="0" distR="0" wp14:anchorId="3244BB9F" wp14:editId="11DE83E1">
+            <wp:extent cx="5400040" cy="3035935"/>
+            <wp:effectExtent l="0" t="0" r="0" b="0"/>
+            <wp:docPr id="9" name="Imagen 9"/>
+            <wp:cNvGraphicFramePr>
+              <a:graphicFrameLocks xmlns:a="http://schemas.openxmlformats.org/drawingml/2006/main" noChangeAspect="1"/>
+            </wp:cNvGraphicFramePr>
+            <a:graphic xmlns:a="http://schemas.openxmlformats.org/drawingml/2006/main">
+              <a:graphicData uri="http://schemas.openxmlformats.org/drawingml/2006/picture">
+                <pic:pic xmlns:pic="http://schemas.openxmlformats.org/drawingml/2006/picture">
+                  <pic:nvPicPr>
+                    <pic:cNvPr id="1" name=""/>
+                    <pic:cNvPicPr/>
+                  </pic:nvPicPr>
+                  <pic:blipFill>
+                    <a:blip r:embed="rId16"/>
+                    <a:stretch>
+                      <a:fillRect/>
+                    </a:stretch>
+                  </pic:blipFill>
+                  <pic:spPr>
+                    <a:xfrm>
+                      <a:off x="0" y="0"/>
+                      <a:ext cx="5400040" cy="3035935"/>
+                    </a:xfrm>
+                    <a:prstGeom prst="rect">
+                      <a:avLst/>
+                    </a:prstGeom>
+                  </pic:spPr>
+                </pic:pic>
+              </a:graphicData>
+            </a:graphic>
+          </wp:inline>
+        </w:drawing>
+      </w:r>
+    </w:p>
+    <w:p>
+      <w:r>
+        <w:t>Archivo “</w:t>
+      </w:r>
+      <w:proofErr w:type="spellStart"/>
+      <w:r>
+        <w:t>index.jps</w:t>
+      </w:r>
+      <w:proofErr w:type="spellEnd"/>
+      <w:r>
+        <w:t>” recién creado.</w:t>
+      </w:r>
+    </w:p>
+    <w:p>
+      <w:r>
+        <w:drawing>
+          <wp:inline distT="0" distB="0" distL="0" distR="0" wp14:anchorId="2075FC4C" wp14:editId="695CB3DE">
+            <wp:extent cx="5400040" cy="3035935"/>
+            <wp:effectExtent l="0" t="0" r="0" b="0"/>
+            <wp:docPr id="10" name="Imagen 10"/>
+            <wp:cNvGraphicFramePr>
+              <a:graphicFrameLocks xmlns:a="http://schemas.openxmlformats.org/drawingml/2006/main" noChangeAspect="1"/>
+            </wp:cNvGraphicFramePr>
+            <a:graphic xmlns:a="http://schemas.openxmlformats.org/drawingml/2006/main">
+              <a:graphicData uri="http://schemas.openxmlformats.org/drawingml/2006/picture">
+                <pic:pic xmlns:pic="http://schemas.openxmlformats.org/drawingml/2006/picture">
+                  <pic:nvPicPr>
+                    <pic:cNvPr id="1" name=""/>
+                    <pic:cNvPicPr/>
+                  </pic:nvPicPr>
+                  <pic:blipFill>
+                    <a:blip r:embed="rId17"/>
+                    <a:stretch>
+                      <a:fillRect/>
+                    </a:stretch>
+                  </pic:blipFill>
+                  <pic:spPr>
+                    <a:xfrm>
+                      <a:off x="0" y="0"/>
+                      <a:ext cx="5400040" cy="3035935"/>
+                    </a:xfrm>
+                    <a:prstGeom prst="rect">
+                      <a:avLst/>
+                    </a:prstGeom>
+                  </pic:spPr>
+                </pic:pic>
+              </a:graphicData>
+            </a:graphic>
+          </wp:inline>
+        </w:drawing>
+      </w:r>
+    </w:p>
+    <w:p>
+      <w:r>
+        <w:t>Código de “</w:t>
+      </w:r>
+      <w:proofErr w:type="spellStart"/>
+      <w:r>
+        <w:t>index.jps</w:t>
+      </w:r>
+      <w:proofErr w:type="spellEnd"/>
+      <w:r>
+        <w:t>” actualizado.</w:t>
+      </w:r>
+    </w:p>
+    <w:p>
+      <w:r>
+        <w:lastRenderedPageBreak/>
+        <w:drawing>
+          <wp:inline distT="0" distB="0" distL="0" distR="0" wp14:anchorId="246D37B2" wp14:editId="0CFE7EA9">
+            <wp:extent cx="5400040" cy="3035935"/>
+            <wp:effectExtent l="0" t="0" r="0" b="0"/>
+            <wp:docPr id="12" name="Imagen 12"/>
+            <wp:cNvGraphicFramePr>
+              <a:graphicFrameLocks xmlns:a="http://schemas.openxmlformats.org/drawingml/2006/main" noChangeAspect="1"/>
+            </wp:cNvGraphicFramePr>
+            <a:graphic xmlns:a="http://schemas.openxmlformats.org/drawingml/2006/main">
+              <a:graphicData uri="http://schemas.openxmlformats.org/drawingml/2006/picture">
+                <pic:pic xmlns:pic="http://schemas.openxmlformats.org/drawingml/2006/picture">
+                  <pic:nvPicPr>
+                    <pic:cNvPr id="1" name=""/>
+                    <pic:cNvPicPr/>
+                  </pic:nvPicPr>
+                  <pic:blipFill>
+                    <a:blip r:embed="rId18"/>
+                    <a:stretch>
+                      <a:fillRect/>
+                    </a:stretch>
+                  </pic:blipFill>
+                  <pic:spPr>
+                    <a:xfrm>
+                      <a:off x="0" y="0"/>
+                      <a:ext cx="5400040" cy="3035935"/>
+                    </a:xfrm>
+                    <a:prstGeom prst="rect">
+                      <a:avLst/>
+                    </a:prstGeom>
+                  </pic:spPr>
+                </pic:pic>
+              </a:graphicData>
+            </a:graphic>
+          </wp:inline>
+        </w:drawing>
+      </w:r>
+    </w:p>
+    <w:p>
+      <w:r>
+        <w:t>Exportando el proyecto en un archivo WAR.</w:t>
+      </w:r>
+    </w:p>
+    <w:p>
+      <w:r>
+        <w:t xml:space="preserve">Una vez exportado el proyecto, si accedemos a </w:t>
+      </w:r>
+      <w:hyperlink r:id="rId19" w:history="1">
+        <w:r>
+          <w:rPr>
+            <w:rStyle w:val="Hipervnculo"/>
+          </w:rPr>
+          <w:t>http://localhost:8080/Actividad2/</w:t>
+        </w:r>
+      </w:hyperlink>
+      <w:r>
+        <w:t>, nos mostrará esto:</w:t>
+      </w:r>
+    </w:p>
+    <w:p>
+      <w:r>
+        <w:rPr>
+          <w:noProof/>
+          <w:lang w:eastAsia="es-ES"/>
+        </w:rPr>
+        <w:drawing>
+          <wp:inline distT="0" distB="0" distL="0" distR="0" wp14:anchorId="1A4DC874" wp14:editId="350FC051">
+            <wp:extent cx="5400040" cy="3035935"/>
+            <wp:effectExtent l="0" t="0" r="0" b="0"/>
+            <wp:docPr id="14" name="Imagen 14"/>
+            <wp:cNvGraphicFramePr>
+              <a:graphicFrameLocks xmlns:a="http://schemas.openxmlformats.org/drawingml/2006/main" noChangeAspect="1"/>
+            </wp:cNvGraphicFramePr>
+            <a:graphic xmlns:a="http://schemas.openxmlformats.org/drawingml/2006/main">
+              <a:graphicData uri="http://schemas.openxmlformats.org/drawingml/2006/picture">
+                <pic:pic xmlns:pic="http://schemas.openxmlformats.org/drawingml/2006/picture">
+                  <pic:nvPicPr>
+                    <pic:cNvPr id="1" name=""/>
+                    <pic:cNvPicPr/>
+                  </pic:nvPicPr>
+                  <pic:blipFill>
+                    <a:blip r:embed="rId20"/>
+                    <a:stretch>
+                      <a:fillRect/>
+                    </a:stretch>
+                  </pic:blipFill>
+                  <pic:spPr>
+                    <a:xfrm>
+                      <a:off x="0" y="0"/>
+                      <a:ext cx="5400040" cy="3035935"/>
+                    </a:xfrm>
+                    <a:prstGeom prst="rect">
+                      <a:avLst/>
+                    </a:prstGeom>
+                  </pic:spPr>
+                </pic:pic>
+              </a:graphicData>
+            </a:graphic>
+          </wp:inline>
+        </w:drawing>
+      </w:r>
+    </w:p>
+    <w:p>
+      <w:r>
+        <w:br w:type="page"/>
+      </w:r>
+    </w:p>
+    <w:p>
+      <w:r>
+        <w:lastRenderedPageBreak/>
+        <w:t>Y si accedemos a “</w:t>
+      </w:r>
+      <w:r>
+        <w:t>http://localhost:8080/Actividad2/</w:t>
+      </w:r>
+      <w:proofErr w:type="spellStart"/>
+      <w:r>
+        <w:t>MyServlet</w:t>
+      </w:r>
+      <w:proofErr w:type="spellEnd"/>
+      <w:r>
+        <w:t>”, nos mostrará esto:</w:t>
+      </w:r>
+    </w:p>
+    <w:p>
+      <w:r>
+        <w:drawing>
+          <wp:inline distT="0" distB="0" distL="0" distR="0" wp14:anchorId="3851A36A" wp14:editId="2EF6F7FE">
+            <wp:extent cx="5400040" cy="3035935"/>
+            <wp:effectExtent l="0" t="0" r="0" b="0"/>
+            <wp:docPr id="15" name="Imagen 15"/>
+            <wp:cNvGraphicFramePr>
+              <a:graphicFrameLocks xmlns:a="http://schemas.openxmlformats.org/drawingml/2006/main" noChangeAspect="1"/>
+            </wp:cNvGraphicFramePr>
+            <a:graphic xmlns:a="http://schemas.openxmlformats.org/drawingml/2006/main">
+              <a:graphicData uri="http://schemas.openxmlformats.org/drawingml/2006/picture">
+                <pic:pic xmlns:pic="http://schemas.openxmlformats.org/drawingml/2006/picture">
+                  <pic:nvPicPr>
+                    <pic:cNvPr id="1" name=""/>
+                    <pic:cNvPicPr/>
+                  </pic:nvPicPr>
+                  <pic:blipFill>
+                    <a:blip r:embed="rId21"/>
+                    <a:stretch>
+                      <a:fillRect/>
+                    </a:stretch>
+                  </pic:blipFill>
+                  <pic:spPr>
+                    <a:xfrm>
+                      <a:off x="0" y="0"/>
+                      <a:ext cx="5400040" cy="3035935"/>
+                    </a:xfrm>
+                    <a:prstGeom prst="rect">
+                      <a:avLst/>
+                    </a:prstGeom>
+                  </pic:spPr>
+                </pic:pic>
+              </a:graphicData>
+            </a:graphic>
+          </wp:inline>
+        </w:drawing>
+      </w:r>
     </w:p>
     <w:p>
       <w:pPr>
-        <w:spacing w:after="240"/>
         <w:rPr>
-          <w:b/>
+          <w:rFonts w:asciiTheme="majorHAnsi" w:eastAsiaTheme="majorEastAsia" w:hAnsiTheme="majorHAnsi" w:cstheme="majorBidi"/>
+          <w:color w:val="2E74B5" w:themeColor="accent1" w:themeShade="BF"/>
+          <w:sz w:val="32"/>
+          <w:szCs w:val="32"/>
         </w:rPr>
       </w:pPr>
-      <w:r>
-        <w:rPr>
-          <w:b/>
-        </w:rPr>
-        <w:t>Enunciado…</w:t>
-      </w:r>
-    </w:p>
-    <w:p>
-      <w:pPr>
-        <w:spacing w:after="240"/>
-      </w:pPr>
-      <w:r>
-        <w:t>Respuesta</w:t>
+      <w:bookmarkStart w:id="2" w:name="_Toc241858149"/>
+      <w:r>
+        <w:br w:type="page"/>
       </w:r>
     </w:p>
     <w:p>
@@ -943,34 +1543,131 @@
         <w:pStyle w:val="Ttulo1"/>
         <w:spacing w:after="240"/>
       </w:pPr>
-      <w:bookmarkStart w:id="3" w:name="_Toc240646880"/>
-      <w:bookmarkStart w:id="4" w:name="_Toc240647016"/>
-      <w:r>
-        <w:t>Ejercicio 2</w:t>
-      </w:r>
+      <w:r>
+        <w:lastRenderedPageBreak/>
+        <w:t>Creación de aplicación simple</w:t>
+      </w:r>
+      <w:bookmarkEnd w:id="2"/>
+    </w:p>
+    <w:p>
+      <w:r>
+        <w:t xml:space="preserve">Ahora, crearemos un código sencillo para </w:t>
+      </w:r>
+      <w:r>
+        <w:t>un programa que comprobará</w:t>
+      </w:r>
+      <w:r>
+        <w:t xml:space="preserve"> si un número </w:t>
+      </w:r>
+      <w:r>
+        <w:t xml:space="preserve">introducido </w:t>
+      </w:r>
+      <w:r>
+        <w:t>es primo o no.</w:t>
+      </w:r>
+    </w:p>
+    <w:p>
+      <w:r>
+        <w:drawing>
+          <wp:inline distT="0" distB="0" distL="0" distR="0" wp14:anchorId="5394A6FC" wp14:editId="08D6F7FA">
+            <wp:extent cx="5400040" cy="3035935"/>
+            <wp:effectExtent l="0" t="0" r="0" b="0"/>
+            <wp:docPr id="16" name="Imagen 16"/>
+            <wp:cNvGraphicFramePr>
+              <a:graphicFrameLocks xmlns:a="http://schemas.openxmlformats.org/drawingml/2006/main" noChangeAspect="1"/>
+            </wp:cNvGraphicFramePr>
+            <a:graphic xmlns:a="http://schemas.openxmlformats.org/drawingml/2006/main">
+              <a:graphicData uri="http://schemas.openxmlformats.org/drawingml/2006/picture">
+                <pic:pic xmlns:pic="http://schemas.openxmlformats.org/drawingml/2006/picture">
+                  <pic:nvPicPr>
+                    <pic:cNvPr id="1" name=""/>
+                    <pic:cNvPicPr/>
+                  </pic:nvPicPr>
+                  <pic:blipFill>
+                    <a:blip r:embed="rId22"/>
+                    <a:stretch>
+                      <a:fillRect/>
+                    </a:stretch>
+                  </pic:blipFill>
+                  <pic:spPr>
+                    <a:xfrm>
+                      <a:off x="0" y="0"/>
+                      <a:ext cx="5400040" cy="3035935"/>
+                    </a:xfrm>
+                    <a:prstGeom prst="rect">
+                      <a:avLst/>
+                    </a:prstGeom>
+                  </pic:spPr>
+                </pic:pic>
+              </a:graphicData>
+            </a:graphic>
+          </wp:inline>
+        </w:drawing>
+      </w:r>
+    </w:p>
+    <w:p>
+      <w:r>
+        <w:t xml:space="preserve">Al entrar en </w:t>
+      </w:r>
+      <w:hyperlink r:id="rId23" w:history="1">
+        <w:r>
+          <w:rPr>
+            <w:rStyle w:val="Hipervnculo"/>
+          </w:rPr>
+          <w:t>http://localhost:8080/Actividad2/</w:t>
+        </w:r>
+      </w:hyperlink>
+      <w:r>
+        <w:t>, lo primero que veremos será esto:</w:t>
+      </w:r>
+    </w:p>
+    <w:p>
+      <w:r>
+        <w:drawing>
+          <wp:inline distT="0" distB="0" distL="0" distR="0" wp14:anchorId="2EFF9B21" wp14:editId="160D0B4D">
+            <wp:extent cx="5400040" cy="3035935"/>
+            <wp:effectExtent l="0" t="0" r="0" b="0"/>
+            <wp:docPr id="17" name="Imagen 17"/>
+            <wp:cNvGraphicFramePr>
+              <a:graphicFrameLocks xmlns:a="http://schemas.openxmlformats.org/drawingml/2006/main" noChangeAspect="1"/>
+            </wp:cNvGraphicFramePr>
+            <a:graphic xmlns:a="http://schemas.openxmlformats.org/drawingml/2006/main">
+              <a:graphicData uri="http://schemas.openxmlformats.org/drawingml/2006/picture">
+                <pic:pic xmlns:pic="http://schemas.openxmlformats.org/drawingml/2006/picture">
+                  <pic:nvPicPr>
+                    <pic:cNvPr id="1" name=""/>
+                    <pic:cNvPicPr/>
+                  </pic:nvPicPr>
+                  <pic:blipFill>
+                    <a:blip r:embed="rId24"/>
+                    <a:stretch>
+                      <a:fillRect/>
+                    </a:stretch>
+                  </pic:blipFill>
+                  <pic:spPr>
+                    <a:xfrm>
+                      <a:off x="0" y="0"/>
+                      <a:ext cx="5400040" cy="3035935"/>
+                    </a:xfrm>
+                    <a:prstGeom prst="rect">
+                      <a:avLst/>
+                    </a:prstGeom>
+                  </pic:spPr>
+                </pic:pic>
+              </a:graphicData>
+            </a:graphic>
+          </wp:inline>
+        </w:drawing>
+      </w:r>
+    </w:p>
+    <w:p>
+      <w:r>
+        <w:t>En el campo de texto, podremos poner un número cualquiera y, al darle a “Comprobar”, el programa nos dirigirá aquí</w:t>
+      </w:r>
+      <w:bookmarkStart w:id="3" w:name="_GoBack"/>
       <w:bookmarkEnd w:id="3"/>
-      <w:bookmarkEnd w:id="4"/>
-    </w:p>
-    <w:p>
-      <w:pPr>
-        <w:spacing w:after="240"/>
-        <w:rPr>
-          <w:b/>
-        </w:rPr>
-      </w:pPr>
-      <w:r>
-        <w:rPr>
-          <w:b/>
-        </w:rPr>
-        <w:t>Enunciado…</w:t>
-      </w:r>
-    </w:p>
-    <w:p>
-      <w:pPr>
-        <w:spacing w:after="240"/>
-      </w:pPr>
-      <w:r>
-        <w:t>Respuesta</w:t>
+      <w:r>
+        <w:br w:type="page"/>
       </w:r>
     </w:p>
     <w:p>
@@ -978,34 +1675,21 @@
         <w:pStyle w:val="Ttulo1"/>
         <w:spacing w:after="240"/>
       </w:pPr>
-      <w:bookmarkStart w:id="5" w:name="_Toc240646881"/>
-      <w:bookmarkStart w:id="6" w:name="_Toc240647017"/>
-      <w:r>
-        <w:t>Ejercicio 3</w:t>
-      </w:r>
+      <w:bookmarkStart w:id="4" w:name="_Toc240646882"/>
+      <w:bookmarkStart w:id="5" w:name="_Toc241858150"/>
+      <w:r>
+        <w:lastRenderedPageBreak/>
+        <w:t>Bibliografía</w:t>
+      </w:r>
+      <w:bookmarkEnd w:id="4"/>
       <w:bookmarkEnd w:id="5"/>
-      <w:bookmarkEnd w:id="6"/>
-    </w:p>
-    <w:p>
-      <w:pPr>
-        <w:spacing w:after="240"/>
-        <w:rPr>
-          <w:b/>
-        </w:rPr>
-      </w:pPr>
-      <w:r>
-        <w:rPr>
-          <w:b/>
-        </w:rPr>
-        <w:t>Enunciado…</w:t>
-      </w:r>
     </w:p>
     <w:p>
       <w:pPr>
         <w:spacing w:after="240"/>
       </w:pPr>
       <w:r>
-        <w:t>Respuesta</w:t>
+        <w:t>Referencia 1: [link]</w:t>
       </w:r>
     </w:p>
     <w:p>
@@ -1013,43 +1697,13 @@
         <w:spacing w:after="240"/>
       </w:pPr>
       <w:r>
-        <w:br w:type="page"/>
-      </w:r>
-    </w:p>
-    <w:p>
-      <w:pPr>
-        <w:pStyle w:val="Ttulo1"/>
-        <w:spacing w:after="240"/>
-      </w:pPr>
-      <w:bookmarkStart w:id="7" w:name="_Toc240646882"/>
-      <w:bookmarkStart w:id="8" w:name="_Toc240647018"/>
-      <w:r>
-        <w:lastRenderedPageBreak/>
-        <w:t>Bibliografía</w:t>
-      </w:r>
-      <w:bookmarkEnd w:id="7"/>
-      <w:bookmarkEnd w:id="8"/>
-    </w:p>
-    <w:p>
-      <w:pPr>
-        <w:spacing w:after="240"/>
-      </w:pPr>
-      <w:r>
-        <w:t>Referencia 1: [link]</w:t>
-      </w:r>
-    </w:p>
-    <w:p>
-      <w:pPr>
-        <w:spacing w:after="240"/>
-      </w:pPr>
-      <w:r>
         <w:t>…</w:t>
       </w:r>
     </w:p>
     <w:sectPr>
-      <w:headerReference w:type="default" r:id="rId8"/>
-      <w:footerReference w:type="default" r:id="rId9"/>
-      <w:headerReference w:type="first" r:id="rId10"/>
+      <w:headerReference w:type="default" r:id="rId25"/>
+      <w:footerReference w:type="default" r:id="rId26"/>
+      <w:headerReference w:type="first" r:id="rId27"/>
       <w:pgSz w:w="11906" w:h="16838"/>
       <w:pgMar w:top="1417" w:right="1701" w:bottom="1417" w:left="1701" w:header="708" w:footer="708" w:gutter="0"/>
       <w:pgNumType w:start="0"/>
@@ -1116,7 +1770,7 @@
           <w:rPr>
             <w:noProof/>
           </w:rPr>
-          <w:t>3</w:t>
+          <w:t>10</w:t>
         </w:r>
         <w:r>
           <w:fldChar w:fldCharType="end"/>
@@ -2084,7 +2738,7 @@
 </file>
 
 <file path=customXml/itemProps2.xml><?xml version="1.0" encoding="utf-8"?>
-<ds:datastoreItem xmlns:ds="http://schemas.openxmlformats.org/officeDocument/2006/customXml" ds:itemID="{16F52694-FA6B-4F23-A984-46E3D5AFCF08}">
+<ds:datastoreItem xmlns:ds="http://schemas.openxmlformats.org/officeDocument/2006/customXml" ds:itemID="{EF5F33DE-A047-4996-BFDE-03A6A2A25348}">
   <ds:schemaRefs>
     <ds:schemaRef ds:uri="http://schemas.openxmlformats.org/officeDocument/2006/bibliography"/>
   </ds:schemaRefs>

</xml_diff>